<commit_message>
Checkpoint in-progress work before Foundation account transition (2026-07-18)
Co-Authored-By: Claude Opus 4.8 (1M context) <noreply@anthropic.com>
</commit_message>
<xml_diff>
--- a/Notes on reference datasets and simulation assumptions.docx
+++ b/Notes on reference datasets and simulation assumptions.docx
@@ -1,6 +1,6 @@
 
 <file path=word/document.xml><?xml version="1.0" encoding="utf-8"?>
-<w:document xmlns:wpc="http://schemas.microsoft.com/office/word/2010/wordprocessingCanvas" xmlns:cx="http://schemas.microsoft.com/office/drawing/2014/chartex" xmlns:cx1="http://schemas.microsoft.com/office/drawing/2015/9/8/chartex" xmlns:cx2="http://schemas.microsoft.com/office/drawing/2015/10/21/chartex" xmlns:cx3="http://schemas.microsoft.com/office/drawing/2016/5/9/chartex" xmlns:cx4="http://schemas.microsoft.com/office/drawing/2016/5/10/chartex" xmlns:cx5="http://schemas.microsoft.com/office/drawing/2016/5/11/chartex" xmlns:cx6="http://schemas.microsoft.com/office/drawing/2016/5/12/chartex" xmlns:cx7="http://schemas.microsoft.com/office/drawing/2016/5/13/chartex" xmlns:cx8="http://schemas.microsoft.com/office/drawing/2016/5/14/chartex" xmlns:mc="http://schemas.openxmlformats.org/markup-compatibility/2006" xmlns:aink="http://schemas.microsoft.com/office/drawing/2016/ink" xmlns:am3d="http://schemas.microsoft.com/office/drawing/2017/model3d" xmlns:o="urn:schemas-microsoft-com:office:office" xmlns:oel="http://schemas.microsoft.com/office/2019/extlst" xmlns:r="http://schemas.openxmlformats.org/officeDocument/2006/relationships" xmlns:m="http://schemas.openxmlformats.org/officeDocument/2006/math" xmlns:v="urn:schemas-microsoft-com:vml" xmlns:wp14="http://schemas.microsoft.com/office/word/2010/wordprocessingDrawing" xmlns:wp="http://schemas.openxmlformats.org/drawingml/2006/wordprocessingDrawing" xmlns:w10="urn:schemas-microsoft-com:office:word" xmlns:w="http://schemas.openxmlformats.org/wordprocessingml/2006/main" xmlns:w14="http://schemas.microsoft.com/office/word/2010/wordml" xmlns:w15="http://schemas.microsoft.com/office/word/2012/wordml" xmlns:w16cex="http://schemas.microsoft.com/office/word/2018/wordml/cex" xmlns:w16cid="http://schemas.microsoft.com/office/word/2016/wordml/cid" xmlns:w16="http://schemas.microsoft.com/office/word/2018/wordml" xmlns:w16sdtdh="http://schemas.microsoft.com/office/word/2020/wordml/sdtdatahash" xmlns:w16se="http://schemas.microsoft.com/office/word/2015/wordml/symex" xmlns:wpg="http://schemas.microsoft.com/office/word/2010/wordprocessingGroup" xmlns:wpi="http://schemas.microsoft.com/office/word/2010/wordprocessingInk" xmlns:wne="http://schemas.microsoft.com/office/word/2006/wordml" xmlns:wps="http://schemas.microsoft.com/office/word/2010/wordprocessingShape" mc:Ignorable="w14 w15 w16se w16cid w16 w16cex w16sdtdh wp14">
+<w:document xmlns:wpc="http://schemas.microsoft.com/office/word/2010/wordprocessingCanvas" xmlns:cx="http://schemas.microsoft.com/office/drawing/2014/chartex" xmlns:cx1="http://schemas.microsoft.com/office/drawing/2015/9/8/chartex" xmlns:cx2="http://schemas.microsoft.com/office/drawing/2015/10/21/chartex" xmlns:cx3="http://schemas.microsoft.com/office/drawing/2016/5/9/chartex" xmlns:cx4="http://schemas.microsoft.com/office/drawing/2016/5/10/chartex" xmlns:cx5="http://schemas.microsoft.com/office/drawing/2016/5/11/chartex" xmlns:cx6="http://schemas.microsoft.com/office/drawing/2016/5/12/chartex" xmlns:cx7="http://schemas.microsoft.com/office/drawing/2016/5/13/chartex" xmlns:cx8="http://schemas.microsoft.com/office/drawing/2016/5/14/chartex" xmlns:mc="http://schemas.openxmlformats.org/markup-compatibility/2006" xmlns:aink="http://schemas.microsoft.com/office/drawing/2016/ink" xmlns:am3d="http://schemas.microsoft.com/office/drawing/2017/model3d" xmlns:o="urn:schemas-microsoft-com:office:office" xmlns:oel="http://schemas.microsoft.com/office/2019/extlst" xmlns:r="http://schemas.openxmlformats.org/officeDocument/2006/relationships" xmlns:m="http://schemas.openxmlformats.org/officeDocument/2006/math" xmlns:v="urn:schemas-microsoft-com:vml" xmlns:wp14="http://schemas.microsoft.com/office/word/2010/wordprocessingDrawing" xmlns:wp="http://schemas.openxmlformats.org/drawingml/2006/wordprocessingDrawing" xmlns:w10="urn:schemas-microsoft-com:office:word" xmlns:w="http://schemas.openxmlformats.org/wordprocessingml/2006/main" xmlns:w14="http://schemas.microsoft.com/office/word/2010/wordml" xmlns:w15="http://schemas.microsoft.com/office/word/2012/wordml" xmlns:w16cex="http://schemas.microsoft.com/office/word/2018/wordml/cex" xmlns:w16cid="http://schemas.microsoft.com/office/word/2016/wordml/cid" xmlns:w16="http://schemas.microsoft.com/office/word/2018/wordml" xmlns:w16du="http://schemas.microsoft.com/office/word/2023/wordml/word16du" xmlns:w16sdtdh="http://schemas.microsoft.com/office/word/2020/wordml/sdtdatahash" xmlns:w16sdtfl="http://schemas.microsoft.com/office/word/2024/wordml/sdtformatlock" xmlns:w16se="http://schemas.microsoft.com/office/word/2015/wordml/symex" xmlns:wpg="http://schemas.microsoft.com/office/word/2010/wordprocessingGroup" xmlns:wpi="http://schemas.microsoft.com/office/word/2010/wordprocessingInk" xmlns:wne="http://schemas.microsoft.com/office/word/2006/wordml" xmlns:wps="http://schemas.microsoft.com/office/word/2010/wordprocessingShape" mc:Ignorable="w14 w15 w16se w16cid w16 w16cex w16sdtdh w16sdtfl w16du wp14">
   <w:body>
     <w:p>
       <w:pPr>
@@ -252,19 +252,11 @@
     </w:p>
     <w:p>
       <w:hyperlink r:id="rId6" w:history="1">
-        <w:proofErr w:type="spellStart"/>
-        <w:r>
-          <w:rPr>
-            <w:rStyle w:val="Hyperlink"/>
-          </w:rPr>
-          <w:t>Mbogo</w:t>
-        </w:r>
-        <w:proofErr w:type="spellEnd"/>
-        <w:r>
-          <w:rPr>
-            <w:rStyle w:val="Hyperlink"/>
-          </w:rPr>
-          <w:t xml:space="preserve"> et al. </w:t>
+        <w:r>
+          <w:rPr>
+            <w:rStyle w:val="Hyperlink"/>
+          </w:rPr>
+          <w:t xml:space="preserve">Mbogo et al. </w:t>
         </w:r>
         <w:r>
           <w:rPr>
@@ -498,15 +490,7 @@
         <w:t xml:space="preserve"> than others.</w:t>
       </w:r>
       <w:r>
-        <w:t xml:space="preserve"> For example, from the maps shown in the publications, it appears that Barani, </w:t>
-      </w:r>
-      <w:proofErr w:type="gramStart"/>
-      <w:r>
-        <w:t>which</w:t>
-      </w:r>
-      <w:proofErr w:type="gramEnd"/>
-      <w:r>
-        <w:t xml:space="preserve"> had the lower bounds, is further from </w:t>
+        <w:t xml:space="preserve"> For example, from the maps shown in the publications, it appears that Barani, which had the lower bounds, is further from </w:t>
       </w:r>
       <w:proofErr w:type="spellStart"/>
       <w:r>
@@ -539,15 +523,7 @@
         <w:t xml:space="preserve">Mwangi et al. 2005 </w:t>
       </w:r>
       <w:r>
-        <w:t xml:space="preserve">cites </w:t>
-      </w:r>
-      <w:proofErr w:type="spellStart"/>
-      <w:r>
-        <w:t>Mbogo</w:t>
-      </w:r>
-      <w:proofErr w:type="spellEnd"/>
-      <w:r>
-        <w:t xml:space="preserve"> et al. 2003 as giving the </w:t>
+        <w:t xml:space="preserve">cites Mbogo et al. 2003 as giving the </w:t>
       </w:r>
       <w:proofErr w:type="spellStart"/>
       <w:r>
@@ -721,15 +697,7 @@
         <w:t>reported</w:t>
       </w:r>
       <w:r>
-        <w:t xml:space="preserve"> in </w:t>
-      </w:r>
-      <w:proofErr w:type="spellStart"/>
-      <w:r>
-        <w:t>Mbogo</w:t>
-      </w:r>
-      <w:proofErr w:type="spellEnd"/>
-      <w:r>
-        <w:t xml:space="preserve"> et al. 1995</w:t>
+        <w:t xml:space="preserve"> in Mbogo et al. 1995</w:t>
       </w:r>
       <w:r>
         <w:t xml:space="preserve"> Table 3</w:t>
@@ -849,7 +817,15 @@
       </w:r>
       <w:proofErr w:type="gramEnd"/>
       <w:r>
-        <w:t xml:space="preserve"> we assume it is the July-survey only. </w:t>
+        <w:t xml:space="preserve"> we assume it is the </w:t>
+      </w:r>
+      <w:proofErr w:type="gramStart"/>
+      <w:r>
+        <w:t>July-survey</w:t>
+      </w:r>
+      <w:proofErr w:type="gramEnd"/>
+      <w:r>
+        <w:t xml:space="preserve"> only. </w:t>
       </w:r>
       <w:r>
         <w:t xml:space="preserve">In calculating likelihoods for recalibration, might be reasonable to approximate the </w:t>
@@ -1028,19 +1004,11 @@
     </w:p>
     <w:p>
       <w:hyperlink r:id="rId9" w:history="1">
-        <w:proofErr w:type="spellStart"/>
-        <w:r>
-          <w:rPr>
-            <w:rStyle w:val="Hyperlink"/>
-          </w:rPr>
-          <w:t>Mbogo</w:t>
-        </w:r>
-        <w:proofErr w:type="spellEnd"/>
-        <w:r>
-          <w:rPr>
-            <w:rStyle w:val="Hyperlink"/>
-          </w:rPr>
-          <w:t xml:space="preserve"> et al. 1995</w:t>
+        <w:r>
+          <w:rPr>
+            <w:rStyle w:val="Hyperlink"/>
+          </w:rPr>
+          <w:t>Mbogo et al. 1995</w:t>
         </w:r>
       </w:hyperlink>
       <w:r>
@@ -1055,26 +1023,16 @@
         <w:t xml:space="preserve"> site</w:t>
       </w:r>
       <w:r>
-        <w:t xml:space="preserve"> (from the maps, it appears that the </w:t>
-      </w:r>
-      <w:proofErr w:type="spellStart"/>
-      <w:r>
-        <w:t>Mukombe</w:t>
-      </w:r>
-      <w:proofErr w:type="spellEnd"/>
+        <w:t xml:space="preserve"> (from the maps, it appears that the Mukombe</w:t>
+      </w:r>
       <w:r>
         <w:t xml:space="preserve"> (MU)</w:t>
       </w:r>
       <w:r>
         <w:t xml:space="preserve">, </w:t>
       </w:r>
-      <w:proofErr w:type="spellStart"/>
-      <w:r>
-        <w:t>Kambi</w:t>
-      </w:r>
-      <w:proofErr w:type="spellEnd"/>
-      <w:r>
-        <w:t xml:space="preserve"> </w:t>
+      <w:r>
+        <w:t xml:space="preserve">Kambi </w:t>
       </w:r>
       <w:proofErr w:type="spellStart"/>
       <w:r>
@@ -1138,13 +1096,8 @@
       <w:r>
         <w:t xml:space="preserve">2.5 to 3.8 and for all study sites ranged from 0 to 59.6. </w:t>
       </w:r>
-      <w:proofErr w:type="spellStart"/>
-      <w:r>
-        <w:t>Mbogo</w:t>
-      </w:r>
-      <w:proofErr w:type="spellEnd"/>
-      <w:r>
-        <w:t xml:space="preserve"> et al. </w:t>
+      <w:r>
+        <w:t xml:space="preserve">Mbogo et al. </w:t>
       </w:r>
       <w:r>
         <w:t>1995</w:t>
@@ -1248,7 +1201,15 @@
       </w:r>
       <w:proofErr w:type="gramEnd"/>
       <w:r>
-        <w:t xml:space="preserve"> we assume it is the July-survey only. </w:t>
+        <w:t xml:space="preserve"> we assume it is the </w:t>
+      </w:r>
+      <w:proofErr w:type="gramStart"/>
+      <w:r>
+        <w:t>July-survey</w:t>
+      </w:r>
+      <w:proofErr w:type="gramEnd"/>
+      <w:r>
+        <w:t xml:space="preserve"> only. </w:t>
       </w:r>
       <w:r>
         <w:t>In calculating likelihoods for recalibration, might be reasonable to approximate the population sizes with the population sizes in each age group from the longitudinal incidence records.</w:t>
@@ -1290,19 +1251,11 @@
         <w:t xml:space="preserve">References: </w:t>
       </w:r>
       <w:hyperlink r:id="rId11" w:history="1">
-        <w:proofErr w:type="spellStart"/>
-        <w:r>
-          <w:rPr>
-            <w:rStyle w:val="Hyperlink"/>
-          </w:rPr>
-          <w:t>Rogier</w:t>
-        </w:r>
-        <w:proofErr w:type="spellEnd"/>
-        <w:r>
-          <w:rPr>
-            <w:rStyle w:val="Hyperlink"/>
-          </w:rPr>
-          <w:t xml:space="preserve"> et al. 1999</w:t>
+        <w:r>
+          <w:rPr>
+            <w:rStyle w:val="Hyperlink"/>
+          </w:rPr>
+          <w:t>Rogier et al. 1999</w:t>
         </w:r>
       </w:hyperlink>
       <w:r>
@@ -1328,19 +1281,11 @@
         <w:t xml:space="preserve">, </w:t>
       </w:r>
       <w:hyperlink r:id="rId13" w:history="1">
-        <w:proofErr w:type="spellStart"/>
-        <w:r>
-          <w:rPr>
-            <w:rStyle w:val="Hyperlink"/>
-          </w:rPr>
-          <w:t>Rogier</w:t>
-        </w:r>
-        <w:proofErr w:type="spellEnd"/>
-        <w:r>
-          <w:rPr>
-            <w:rStyle w:val="Hyperlink"/>
-          </w:rPr>
-          <w:t xml:space="preserve"> and </w:t>
+        <w:r>
+          <w:rPr>
+            <w:rStyle w:val="Hyperlink"/>
+          </w:rPr>
+          <w:t xml:space="preserve">Rogier and </w:t>
         </w:r>
         <w:proofErr w:type="spellStart"/>
         <w:r>
@@ -1402,29 +1347,29 @@
         <w:t xml:space="preserve">in </w:t>
       </w:r>
       <w:hyperlink r:id="rId15" w:history="1">
-        <w:proofErr w:type="spellStart"/>
-        <w:r>
-          <w:rPr>
-            <w:rStyle w:val="Hyperlink"/>
-          </w:rPr>
-          <w:t>Rogier</w:t>
-        </w:r>
-        <w:proofErr w:type="spellEnd"/>
-        <w:r>
-          <w:rPr>
-            <w:rStyle w:val="Hyperlink"/>
-          </w:rPr>
-          <w:t xml:space="preserve"> et al. 1999</w:t>
+        <w:r>
+          <w:rPr>
+            <w:rStyle w:val="Hyperlink"/>
+          </w:rPr>
+          <w:t>Rogier et al. 1999</w:t>
         </w:r>
       </w:hyperlink>
       <w:r>
         <w:t xml:space="preserve">, the frequency of home visits is described as daily, so it is possible it changed over time). </w:t>
       </w:r>
       <w:r>
-        <w:t xml:space="preserve">Twice a week, a thick blood film was made. In addition, each compound was visited daily to detect new cases of fever and the dispensary </w:t>
+        <w:t xml:space="preserve">Twice a week, a thick blood film was made. In addition, each compound was visited daily to detect new cases of </w:t>
       </w:r>
       <w:proofErr w:type="gramStart"/>
       <w:r>
+        <w:t>fever</w:t>
+      </w:r>
+      <w:proofErr w:type="gramEnd"/>
+      <w:r>
+        <w:t xml:space="preserve"> and the dispensary </w:t>
+      </w:r>
+      <w:proofErr w:type="gramStart"/>
+      <w:r>
         <w:t>was open at all times</w:t>
       </w:r>
       <w:proofErr w:type="gramEnd"/>
@@ -1488,15 +1433,7 @@
         <w:t xml:space="preserve"> </w:t>
       </w:r>
       <w:r>
-        <w:t xml:space="preserve">condition would be monitored and under several </w:t>
-      </w:r>
-      <w:proofErr w:type="gramStart"/>
-      <w:r>
-        <w:t>conditions</w:t>
-      </w:r>
-      <w:proofErr w:type="gramEnd"/>
-      <w:r>
-        <w:t xml:space="preserve"> treatment would be given for malaria in subsequent days</w:t>
+        <w:t>condition would be monitored and under several conditions treatment would be given for malaria in subsequent days</w:t>
       </w:r>
       <w:r>
         <w:t xml:space="preserve"> (described in </w:t>
@@ -1687,19 +1624,11 @@
         <w:t xml:space="preserve"> </w:t>
       </w:r>
       <w:hyperlink r:id="rId23" w:history="1">
-        <w:proofErr w:type="spellStart"/>
-        <w:r>
-          <w:rPr>
-            <w:rStyle w:val="Hyperlink"/>
-          </w:rPr>
-          <w:t>Rogier</w:t>
-        </w:r>
-        <w:proofErr w:type="spellEnd"/>
-        <w:r>
-          <w:rPr>
-            <w:rStyle w:val="Hyperlink"/>
-          </w:rPr>
-          <w:t xml:space="preserve"> et al. 1999</w:t>
+        <w:r>
+          <w:rPr>
+            <w:rStyle w:val="Hyperlink"/>
+          </w:rPr>
+          <w:t>Rogier et al. 1999</w:t>
         </w:r>
       </w:hyperlink>
       <w:r>
@@ -1914,19 +1843,11 @@
         <w:t xml:space="preserve">References: </w:t>
       </w:r>
       <w:hyperlink r:id="rId27" w:history="1">
-        <w:proofErr w:type="spellStart"/>
-        <w:r>
-          <w:rPr>
-            <w:rStyle w:val="Hyperlink"/>
-          </w:rPr>
-          <w:t>Rogier</w:t>
-        </w:r>
-        <w:proofErr w:type="spellEnd"/>
-        <w:r>
-          <w:rPr>
-            <w:rStyle w:val="Hyperlink"/>
-          </w:rPr>
-          <w:t xml:space="preserve"> et al. 1999</w:t>
+        <w:r>
+          <w:rPr>
+            <w:rStyle w:val="Hyperlink"/>
+          </w:rPr>
+          <w:t>Rogier et al. 1999</w:t>
         </w:r>
       </w:hyperlink>
       <w:r>
@@ -1952,32 +1873,24 @@
         <w:t xml:space="preserve">, </w:t>
       </w:r>
       <w:hyperlink r:id="rId29" w:history="1">
+        <w:r>
+          <w:rPr>
+            <w:rStyle w:val="Hyperlink"/>
+          </w:rPr>
+          <w:t xml:space="preserve">Rogier and </w:t>
+        </w:r>
         <w:proofErr w:type="spellStart"/>
         <w:r>
           <w:rPr>
             <w:rStyle w:val="Hyperlink"/>
           </w:rPr>
-          <w:t>Rogier</w:t>
+          <w:t>Trape</w:t>
         </w:r>
         <w:proofErr w:type="spellEnd"/>
         <w:r>
           <w:rPr>
             <w:rStyle w:val="Hyperlink"/>
           </w:rPr>
-          <w:t xml:space="preserve"> and </w:t>
-        </w:r>
-        <w:proofErr w:type="spellStart"/>
-        <w:r>
-          <w:rPr>
-            <w:rStyle w:val="Hyperlink"/>
-          </w:rPr>
-          <w:t>Trape</w:t>
-        </w:r>
-        <w:proofErr w:type="spellEnd"/>
-        <w:r>
-          <w:rPr>
-            <w:rStyle w:val="Hyperlink"/>
-          </w:rPr>
           <w:t xml:space="preserve"> 1995</w:t>
         </w:r>
       </w:hyperlink>
@@ -2021,32 +1934,14 @@
       <w:r>
         <w:t>(</w:t>
       </w:r>
-      <w:proofErr w:type="spellStart"/>
-      <w:r>
-        <w:fldChar w:fldCharType="begin"/>
-      </w:r>
-      <w:r>
-        <w:instrText xml:space="preserve"> HYPERLINK "https://pubmed.ncbi.nlm.nih.gov/10697865/" </w:instrText>
-      </w:r>
-      <w:r>
-        <w:fldChar w:fldCharType="separate"/>
-      </w:r>
-      <w:r>
-        <w:rPr>
-          <w:rStyle w:val="Hyperlink"/>
-        </w:rPr>
-        <w:t>Rogier</w:t>
-      </w:r>
-      <w:proofErr w:type="spellEnd"/>
-      <w:r>
-        <w:rPr>
-          <w:rStyle w:val="Hyperlink"/>
-        </w:rPr>
-        <w:t xml:space="preserve"> et al. 1999</w:t>
-      </w:r>
-      <w:r>
-        <w:fldChar w:fldCharType="end"/>
-      </w:r>
+      <w:hyperlink r:id="rId30" w:history="1">
+        <w:r>
+          <w:rPr>
+            <w:rStyle w:val="Hyperlink"/>
+          </w:rPr>
+          <w:t>Rogier et al. 1999</w:t>
+        </w:r>
+      </w:hyperlink>
       <w:r>
         <w:t>)</w:t>
       </w:r>
@@ -2092,7 +1987,7 @@
       <w:r>
         <w:t xml:space="preserve"> without treatment and only include the high rate of treatment during the study year rather than simulating a single cohort with consistent high treatment. In </w:t>
       </w:r>
-      <w:hyperlink r:id="rId30" w:history="1">
+      <w:hyperlink r:id="rId31" w:history="1">
         <w:r>
           <w:rPr>
             <w:rStyle w:val="Hyperlink"/>
@@ -2103,7 +1998,7 @@
       <w:r>
         <w:t xml:space="preserve">, there was a 30% probability per day of treatment after fever onset, which would mean that nearly everyone was treated within a few days. In </w:t>
       </w:r>
-      <w:hyperlink r:id="rId31" w:history="1">
+      <w:hyperlink r:id="rId32" w:history="1">
         <w:r>
           <w:rPr>
             <w:rStyle w:val="Hyperlink"/>
@@ -2165,7 +2060,7 @@
       <w:r>
         <w:t xml:space="preserve">Taken from prior recalibration setup (I assume – values were in </w:t>
       </w:r>
-      <w:hyperlink r:id="rId32" w:anchor="L37" w:history="1">
+      <w:hyperlink r:id="rId33" w:anchor="L37" w:history="1">
         <w:r>
           <w:rPr>
             <w:rStyle w:val="Hyperlink"/>
@@ -2176,7 +2071,7 @@
       <w:r>
         <w:t xml:space="preserve">). I assume these values are the same ones used in </w:t>
       </w:r>
-      <w:hyperlink r:id="rId33" w:history="1">
+      <w:hyperlink r:id="rId34" w:history="1">
         <w:r>
           <w:rPr>
             <w:rStyle w:val="Hyperlink"/>
@@ -2187,7 +2082,7 @@
       <w:r>
         <w:t xml:space="preserve"> and </w:t>
       </w:r>
-      <w:hyperlink r:id="rId34" w:history="1">
+      <w:hyperlink r:id="rId35" w:history="1">
         <w:r>
           <w:rPr>
             <w:rStyle w:val="Hyperlink"/>
@@ -2200,20 +2095,12 @@
       </w:r>
     </w:p>
     <w:p>
-      <w:hyperlink r:id="rId35" w:history="1">
-        <w:proofErr w:type="spellStart"/>
-        <w:r>
-          <w:rPr>
-            <w:rStyle w:val="Hyperlink"/>
-          </w:rPr>
-          <w:t>Rogier</w:t>
-        </w:r>
-        <w:proofErr w:type="spellEnd"/>
-        <w:r>
-          <w:rPr>
-            <w:rStyle w:val="Hyperlink"/>
-          </w:rPr>
-          <w:t xml:space="preserve"> et al. 1999</w:t>
+      <w:hyperlink r:id="rId36" w:history="1">
+        <w:r>
+          <w:rPr>
+            <w:rStyle w:val="Hyperlink"/>
+          </w:rPr>
+          <w:t>Rogier et al. 1999</w:t>
         </w:r>
       </w:hyperlink>
       <w:r>
@@ -2249,7 +2136,7 @@
       <w:r>
         <w:t xml:space="preserve">Age-incidence and age-prevalence reference datasets come from the csv associated with </w:t>
       </w:r>
-      <w:hyperlink r:id="rId36" w:anchor="Sec21" w:history="1">
+      <w:hyperlink r:id="rId37" w:anchor="Sec21" w:history="1">
         <w:r>
           <w:rPr>
             <w:rStyle w:val="Hyperlink"/>
@@ -2289,7 +2176,7 @@
         </w:rPr>
         <w:t>Note that we simulate treatment with chloroquine instead of quinine, since quinine is not currently a default drug (</w:t>
       </w:r>
-      <w:hyperlink r:id="rId37" w:history="1">
+      <w:hyperlink r:id="rId38" w:history="1">
         <w:r>
           <w:rPr>
             <w:rStyle w:val="Hyperlink"/>
@@ -2307,7 +2194,7 @@
       <w:r>
         <w:t xml:space="preserve"> Originally, we simulated chloroquine instead of quinine, but this yielded very long protection against reinfection. We now assume the same parameters as ACT for quinine. See </w:t>
       </w:r>
-      <w:hyperlink r:id="rId38" w:history="1">
+      <w:hyperlink r:id="rId39" w:history="1">
         <w:r>
           <w:rPr>
             <w:rStyle w:val="Hyperlink"/>
@@ -2368,20 +2255,15 @@
       <w:pPr>
         <w:pStyle w:val="Heading3"/>
       </w:pPr>
-      <w:proofErr w:type="spellStart"/>
-      <w:r>
-        <w:t>Koundou</w:t>
-      </w:r>
-      <w:proofErr w:type="spellEnd"/>
-      <w:r>
-        <w:t>, Cameroon, 1997-1998</w:t>
+      <w:r>
+        <w:t>Koundou, Cameroon, 1997-1998</w:t>
       </w:r>
     </w:p>
     <w:p>
       <w:r>
         <w:t xml:space="preserve">Paper: </w:t>
       </w:r>
-      <w:hyperlink r:id="rId39" w:history="1">
+      <w:hyperlink r:id="rId40" w:history="1">
         <w:r>
           <w:rPr>
             <w:rStyle w:val="Hyperlink"/>
@@ -2471,7 +2353,7 @@
       <w:r>
         <w:t xml:space="preserve">(originally published in </w:t>
       </w:r>
-      <w:hyperlink r:id="rId40" w:history="1">
+      <w:hyperlink r:id="rId41" w:history="1">
         <w:r>
           <w:rPr>
             <w:rStyle w:val="Hyperlink"/>
@@ -2489,15 +2371,7 @@
         <w:t>s</w:t>
       </w:r>
       <w:r>
-        <w:t xml:space="preserve"> 12.7 bites/person/night in </w:t>
-      </w:r>
-      <w:proofErr w:type="spellStart"/>
-      <w:r>
-        <w:t>Koundou</w:t>
-      </w:r>
-      <w:proofErr w:type="spellEnd"/>
-      <w:r>
-        <w:t xml:space="preserve"> and 1.1 bites/person/night in </w:t>
+        <w:t xml:space="preserve"> 12.7 bites/person/night in Koundou and 1.1 bites/person/night in </w:t>
       </w:r>
       <w:proofErr w:type="spellStart"/>
       <w:r>
@@ -2505,15 +2379,7 @@
       </w:r>
       <w:proofErr w:type="spellEnd"/>
       <w:r>
-        <w:t xml:space="preserve">. The calculate the EIR as 176.1 in </w:t>
-      </w:r>
-      <w:proofErr w:type="spellStart"/>
-      <w:r>
-        <w:t>Koundou</w:t>
-      </w:r>
-      <w:proofErr w:type="spellEnd"/>
-      <w:r>
-        <w:t xml:space="preserve"> and 17.7 in </w:t>
+        <w:t xml:space="preserve">. The calculate the EIR as 176.1 in Koundou and 17.7 in </w:t>
       </w:r>
       <w:proofErr w:type="spellStart"/>
       <w:r>
@@ -2610,29 +2476,13 @@
         <w:t xml:space="preserve"> the</w:t>
       </w:r>
       <w:r>
-        <w:t xml:space="preserve"> same seasonality as seen in </w:t>
-      </w:r>
-      <w:proofErr w:type="spellStart"/>
-      <w:r>
-        <w:t>Koundou</w:t>
-      </w:r>
-      <w:proofErr w:type="spellEnd"/>
-      <w:r>
-        <w:t>.</w:t>
+        <w:t xml:space="preserve"> same seasonality as seen in Koundou.</w:t>
       </w:r>
       <w:r>
         <w:t xml:space="preserve"> Ultimately, to calculate the monthly EIR, we 1) </w:t>
       </w:r>
       <w:r>
-        <w:t xml:space="preserve">calculate the mean of the two sample dates in each month for </w:t>
-      </w:r>
-      <w:proofErr w:type="spellStart"/>
-      <w:r>
-        <w:t>Koundou</w:t>
-      </w:r>
-      <w:proofErr w:type="spellEnd"/>
-      <w:r>
-        <w:t xml:space="preserve">, 2) </w:t>
+        <w:t xml:space="preserve">calculate the mean of the two sample dates in each month for Koundou, 2) </w:t>
       </w:r>
       <w:r>
         <w:t>set</w:t>
@@ -2677,7 +2527,7 @@
       <w:r>
         <w:t xml:space="preserve">Age-incidence and age-prevalence reference datasets come from the csv associated with </w:t>
       </w:r>
-      <w:hyperlink r:id="rId41" w:anchor="Sec21" w:history="1">
+      <w:hyperlink r:id="rId42" w:anchor="Sec21" w:history="1">
         <w:r>
           <w:rPr>
             <w:rStyle w:val="Hyperlink"/>
@@ -2723,9 +2573,17 @@
       <w:pPr>
         <w:pStyle w:val="Heading3"/>
       </w:pPr>
-      <w:proofErr w:type="spellStart"/>
-      <w:r>
-        <w:t>Dongubougou</w:t>
+      <w:r>
+        <w:t>Dongubougou, Mali, 1999-2000</w:t>
+      </w:r>
+    </w:p>
+    <w:p>
+      <w:pPr>
+        <w:pStyle w:val="Heading3"/>
+      </w:pPr>
+      <w:proofErr w:type="spellStart"/>
+      <w:r>
+        <w:t>Sotuba</w:t>
       </w:r>
       <w:proofErr w:type="spellEnd"/>
       <w:r>
@@ -2733,36 +2591,15 @@
       </w:r>
     </w:p>
     <w:p>
-      <w:pPr>
-        <w:pStyle w:val="Heading3"/>
-      </w:pPr>
-      <w:proofErr w:type="spellStart"/>
-      <w:r>
-        <w:t>Sotuba</w:t>
-      </w:r>
-      <w:proofErr w:type="spellEnd"/>
-      <w:r>
-        <w:t>, Mali, 1999-2000</w:t>
-      </w:r>
-    </w:p>
-    <w:p>
       <w:r>
         <w:t xml:space="preserve">Paper: </w:t>
       </w:r>
-      <w:hyperlink r:id="rId42" w:history="1">
-        <w:proofErr w:type="spellStart"/>
-        <w:r>
-          <w:rPr>
-            <w:rStyle w:val="Hyperlink"/>
-          </w:rPr>
-          <w:t>Dicko</w:t>
-        </w:r>
-        <w:proofErr w:type="spellEnd"/>
-        <w:r>
-          <w:rPr>
-            <w:rStyle w:val="Hyperlink"/>
-          </w:rPr>
-          <w:t xml:space="preserve"> et al. 2007</w:t>
+      <w:hyperlink r:id="rId43" w:history="1">
+        <w:r>
+          <w:rPr>
+            <w:rStyle w:val="Hyperlink"/>
+          </w:rPr>
+          <w:t>Dicko et al. 2007</w:t>
         </w:r>
       </w:hyperlink>
     </w:p>
@@ -2921,24 +2758,11 @@
       </w:r>
     </w:p>
     <w:p>
-      <w:proofErr w:type="spellStart"/>
-      <w:r>
-        <w:t>Dicko</w:t>
-      </w:r>
-      <w:proofErr w:type="spellEnd"/>
-      <w:r>
-        <w:t xml:space="preserve"> et al. reports that “</w:t>
-      </w:r>
-      <w:r>
-        <w:t xml:space="preserve">There is essentially no malaria transmission at either site during the dry season (January to June) (Y. T. </w:t>
-      </w:r>
-      <w:proofErr w:type="spellStart"/>
-      <w:r>
-        <w:t>Toure</w:t>
-      </w:r>
-      <w:proofErr w:type="spellEnd"/>
-      <w:r>
-        <w:t>, unpublished results)</w:t>
+      <w:r>
+        <w:t>Dicko et al. reports that “</w:t>
+      </w:r>
+      <w:r>
+        <w:t>There is essentially no malaria transmission at either site during the dry season (January to June) (Y. T. Toure, unpublished results)</w:t>
       </w:r>
       <w:r>
         <w:t>.</w:t>
@@ -2996,15 +2820,7 @@
         <w:t>Both PSC and HLC were used to calculate EIR, giving wildly different estimates</w:t>
       </w:r>
       <w:r>
-        <w:t xml:space="preserve"> (Table 2 of </w:t>
-      </w:r>
-      <w:proofErr w:type="spellStart"/>
-      <w:r>
-        <w:t>Dicko</w:t>
-      </w:r>
-      <w:proofErr w:type="spellEnd"/>
-      <w:r>
-        <w:t xml:space="preserve"> et al. 2007). We use the monthly estimates generated with HLCs</w:t>
+        <w:t xml:space="preserve"> (Table 2 of Dicko et al. 2007). We use the monthly estimates generated with HLCs</w:t>
       </w:r>
       <w:r>
         <w:t>, taking the average between the two surveyed years</w:t>
@@ -3037,7 +2853,7 @@
       <w:r>
         <w:t xml:space="preserve">The reference data for age-incidence and age-prevalence for these sites come from the </w:t>
       </w:r>
-      <w:hyperlink r:id="rId43" w:anchor="Sec21" w:history="1">
+      <w:hyperlink r:id="rId44" w:anchor="Sec21" w:history="1">
         <w:r>
           <w:rPr>
             <w:rStyle w:val="Hyperlink"/>
@@ -3148,14 +2964,66 @@
         </w:rPr>
         <w:t xml:space="preserve">relevant papers include: </w:t>
       </w:r>
-      <w:hyperlink r:id="rId44" w:history="1">
+      <w:hyperlink r:id="rId45" w:history="1">
+        <w:r>
+          <w:rPr>
+            <w:rStyle w:val="Hyperlink"/>
+            <w:rFonts w:ascii="Calibri" w:hAnsi="Calibri" w:cs="Calibri"/>
+          </w:rPr>
+          <w:t>Bretscher et al. 2011</w:t>
+        </w:r>
+      </w:hyperlink>
+      <w:r>
+        <w:rPr>
+          <w:rFonts w:ascii="Calibri" w:hAnsi="Calibri" w:cs="Calibri"/>
+        </w:rPr>
+        <w:t xml:space="preserve">, </w:t>
+      </w:r>
+      <w:hyperlink r:id="rId46" w:history="1">
+        <w:r>
+          <w:rPr>
+            <w:rStyle w:val="Hyperlink"/>
+            <w:rFonts w:ascii="Calibri" w:hAnsi="Calibri" w:cs="Calibri"/>
+          </w:rPr>
+          <w:t>Bretscher et al. 2015</w:t>
+        </w:r>
+      </w:hyperlink>
+      <w:r>
+        <w:rPr>
+          <w:rFonts w:ascii="Calibri" w:hAnsi="Calibri" w:cs="Calibri"/>
+        </w:rPr>
+        <w:t xml:space="preserve">, </w:t>
+      </w:r>
+      <w:hyperlink r:id="rId47" w:history="1">
+        <w:r>
+          <w:rPr>
+            <w:rStyle w:val="Hyperlink"/>
+            <w:rFonts w:ascii="Calibri" w:hAnsi="Calibri" w:cs="Calibri"/>
+          </w:rPr>
+          <w:t>Felger et al. 2012</w:t>
+        </w:r>
+      </w:hyperlink>
+      <w:r>
+        <w:rPr>
+          <w:rFonts w:ascii="Calibri" w:hAnsi="Calibri" w:cs="Calibri"/>
+        </w:rPr>
+        <w:t xml:space="preserve">, </w:t>
+      </w:r>
+      <w:hyperlink r:id="rId48" w:history="1">
+        <w:r>
+          <w:rPr>
+            <w:rStyle w:val="Hyperlink"/>
+            <w:rFonts w:ascii="Calibri" w:hAnsi="Calibri" w:cs="Calibri"/>
+          </w:rPr>
+          <w:t>Owusu-</w:t>
+        </w:r>
         <w:proofErr w:type="spellStart"/>
         <w:r>
           <w:rPr>
             <w:rStyle w:val="Hyperlink"/>
             <w:rFonts w:ascii="Calibri" w:hAnsi="Calibri" w:cs="Calibri"/>
           </w:rPr>
-          <w:t>Bretscher</w:t>
+          <w:t>Aguei</w:t>
         </w:r>
         <w:proofErr w:type="spellEnd"/>
         <w:r>
@@ -3163,461 +3031,307 @@
             <w:rStyle w:val="Hyperlink"/>
             <w:rFonts w:ascii="Calibri" w:hAnsi="Calibri" w:cs="Calibri"/>
           </w:rPr>
-          <w:t xml:space="preserve"> et al. 2011</w:t>
-        </w:r>
-      </w:hyperlink>
-      <w:r>
+          <w:t xml:space="preserve"> et al. 2002</w:t>
+        </w:r>
+      </w:hyperlink>
+    </w:p>
+    <w:p>
+      <w:pPr>
         <w:rPr>
           <w:rFonts w:ascii="Calibri" w:hAnsi="Calibri" w:cs="Calibri"/>
         </w:rPr>
+      </w:pPr>
+      <w:hyperlink r:id="rId49" w:history="1">
+        <w:r>
+          <w:rPr>
+            <w:rStyle w:val="Hyperlink"/>
+            <w:rFonts w:ascii="Calibri" w:hAnsi="Calibri" w:cs="Calibri"/>
+          </w:rPr>
+          <w:t>Data on Malaria Team Dropbox</w:t>
+        </w:r>
+      </w:hyperlink>
+    </w:p>
+    <w:p>
+      <w:pPr>
+        <w:pStyle w:val="Heading4"/>
+      </w:pPr>
+      <w:r>
+        <w:t>Case management</w:t>
+      </w:r>
+    </w:p>
+    <w:p>
+      <w:r>
+        <w:t>Treatment was not administered as part of the study, though individuals who were sick at a survey date “were referred to routine health services” (</w:t>
+      </w:r>
+      <w:hyperlink r:id="rId50" w:history="1">
+        <w:r>
+          <w:rPr>
+            <w:rStyle w:val="Hyperlink"/>
+            <w:rFonts w:ascii="Calibri" w:hAnsi="Calibri" w:cs="Calibri"/>
+          </w:rPr>
+          <w:t>Felger et al. 2012</w:t>
+        </w:r>
+      </w:hyperlink>
+      <w:r>
+        <w:t>). It does not sound like antimalarial treatments were common,</w:t>
+      </w:r>
+      <w:r>
+        <w:t xml:space="preserve"> and most were likely given to younger children: “</w:t>
+      </w:r>
+      <w:r>
+        <w:t>For the youngest age groups, short durations may partly reflect effects of antimalaria treatment, mainly affecting &lt;2 years old children. Treatment was infrequent but could not be formally incorporated into the models because of absence of comprehensive individual-level data</w:t>
+      </w:r>
+      <w:r>
+        <w:t>”</w:t>
+      </w:r>
+      <w:r>
+        <w:t xml:space="preserve"> </w:t>
+      </w:r>
+      <w:r>
+        <w:t>(</w:t>
+      </w:r>
+      <w:hyperlink r:id="rId51" w:history="1">
+        <w:r>
+          <w:rPr>
+            <w:rStyle w:val="Hyperlink"/>
+            <w:rFonts w:ascii="Calibri" w:hAnsi="Calibri" w:cs="Calibri"/>
+          </w:rPr>
+          <w:t>Felger et al. 2012</w:t>
+        </w:r>
+      </w:hyperlink>
+      <w:r>
+        <w:t>).</w:t>
+      </w:r>
+    </w:p>
+    <w:p>
+      <w:r>
+        <w:t xml:space="preserve">Lacking other information, we assume a treatment rate </w:t>
+      </w:r>
+      <w:r>
+        <w:t xml:space="preserve">for clinical malaria </w:t>
+      </w:r>
+      <w:r>
+        <w:t>of 20% in children U5, 10% in adults, and 50% in severe cases</w:t>
+      </w:r>
+      <w:r>
+        <w:t>, both before and during the study</w:t>
+      </w:r>
+      <w:r>
+        <w:t xml:space="preserve"> period</w:t>
+      </w:r>
+      <w:r>
+        <w:t>.</w:t>
+      </w:r>
+      <w:r>
+        <w:t xml:space="preserve"> </w:t>
+      </w:r>
+    </w:p>
+    <w:p>
+      <w:pPr>
+        <w:pStyle w:val="Heading4"/>
+      </w:pPr>
+      <w:r>
+        <w:t>EIR</w:t>
+      </w:r>
+    </w:p>
+    <w:p>
+      <w:pPr>
+        <w:rPr>
+          <w:rFonts w:ascii="Calibri" w:hAnsi="Calibri" w:cs="Calibri"/>
+        </w:rPr>
+      </w:pPr>
+      <w:r>
+        <w:rPr>
+          <w:rFonts w:ascii="Calibri" w:hAnsi="Calibri" w:cs="Calibri"/>
+        </w:rPr>
+        <w:t xml:space="preserve">The </w:t>
+      </w:r>
+      <w:r>
+        <w:rPr>
+          <w:rFonts w:ascii="Calibri" w:hAnsi="Calibri" w:cs="Calibri"/>
+        </w:rPr>
+        <w:t>average of three years (2001-2003) of monthly EIRs reported in Kasasa et al. 2013</w:t>
+      </w:r>
+      <w:r>
+        <w:rPr>
+          <w:rFonts w:ascii="Calibri" w:hAnsi="Calibri" w:cs="Calibri"/>
+        </w:rPr>
+        <w:t xml:space="preserve"> were used</w:t>
+      </w:r>
+      <w:r>
+        <w:rPr>
+          <w:rFonts w:ascii="Calibri" w:hAnsi="Calibri" w:cs="Calibri"/>
+        </w:rPr>
+        <w:t xml:space="preserve">. </w:t>
+      </w:r>
+      <w:r>
+        <w:rPr>
+          <w:rFonts w:ascii="Calibri" w:hAnsi="Calibri" w:cs="Calibri"/>
+        </w:rPr>
+        <w:t>The resulting seasonality and magnitude of EIRs are</w:t>
+      </w:r>
+      <w:r>
+        <w:rPr>
+          <w:rFonts w:ascii="Calibri" w:hAnsi="Calibri" w:cs="Calibri"/>
+        </w:rPr>
+        <w:t xml:space="preserve"> </w:t>
+      </w:r>
+      <w:proofErr w:type="gramStart"/>
+      <w:r>
+        <w:rPr>
+          <w:rFonts w:ascii="Calibri" w:hAnsi="Calibri" w:cs="Calibri"/>
+        </w:rPr>
+        <w:t>fairly similar</w:t>
+      </w:r>
+      <w:proofErr w:type="gramEnd"/>
+      <w:r>
+        <w:rPr>
+          <w:rFonts w:ascii="Calibri" w:hAnsi="Calibri" w:cs="Calibri"/>
+        </w:rPr>
+        <w:t xml:space="preserve"> to </w:t>
+      </w:r>
+      <w:r>
+        <w:rPr>
+          <w:rFonts w:ascii="Calibri" w:hAnsi="Calibri" w:cs="Calibri"/>
+        </w:rPr>
+        <w:t xml:space="preserve">the EIRs used for </w:t>
+      </w:r>
+      <w:proofErr w:type="spellStart"/>
+      <w:r>
+        <w:rPr>
+          <w:rFonts w:ascii="Calibri" w:hAnsi="Calibri" w:cs="Calibri"/>
+        </w:rPr>
+        <w:t>Dapelogo</w:t>
+      </w:r>
+      <w:proofErr w:type="spellEnd"/>
+      <w:r>
+        <w:rPr>
+          <w:rFonts w:ascii="Calibri" w:hAnsi="Calibri" w:cs="Calibri"/>
+        </w:rPr>
+        <w:t xml:space="preserve">, which is somewhat nearby. </w:t>
+      </w:r>
+      <w:r>
+        <w:rPr>
+          <w:rFonts w:ascii="Calibri" w:hAnsi="Calibri" w:cs="Calibri"/>
+        </w:rPr>
+        <w:t>However, there was a substantial amount of variation between the years in Kasasa et al, so adjustments to the magnitude of EIR may be warranted.</w:t>
+      </w:r>
+    </w:p>
+    <w:p>
+      <w:pPr>
+        <w:pStyle w:val="Heading4"/>
+      </w:pPr>
+      <w:r>
+        <w:t>Reference dataset</w:t>
+      </w:r>
+      <w:r>
+        <w:t>s</w:t>
+      </w:r>
+    </w:p>
+    <w:p>
+      <w:pPr>
+        <w:rPr>
+          <w:rFonts w:ascii="Calibri" w:hAnsi="Calibri" w:cs="Calibri"/>
+        </w:rPr>
+      </w:pPr>
+      <w:r>
+        <w:rPr>
+          <w:rFonts w:ascii="Calibri" w:hAnsi="Calibri" w:cs="Calibri"/>
+        </w:rPr>
+        <w:t>The</w:t>
+      </w:r>
+      <w:r>
+        <w:rPr>
+          <w:rFonts w:ascii="Calibri" w:hAnsi="Calibri" w:cs="Calibri"/>
+        </w:rPr>
+        <w:t xml:space="preserve"> </w:t>
+      </w:r>
+      <w:r>
+        <w:rPr>
+          <w:rFonts w:ascii="Calibri" w:hAnsi="Calibri" w:cs="Calibri"/>
+        </w:rPr>
+        <w:t xml:space="preserve">parasite density and duration-of-infection datasets come from </w:t>
+      </w:r>
+      <w:r>
+        <w:rPr>
+          <w:rFonts w:ascii="Calibri" w:hAnsi="Calibri" w:cs="Calibri"/>
+        </w:rPr>
+        <w:t>an age-stratified cohort of 347 individuals who were sampled every two months for a year (</w:t>
+      </w:r>
+      <w:r>
+        <w:rPr>
+          <w:rFonts w:ascii="Calibri" w:hAnsi="Calibri" w:cs="Calibri"/>
+        </w:rPr>
+        <w:t xml:space="preserve">for a total of </w:t>
+      </w:r>
+      <w:r>
+        <w:rPr>
+          <w:rFonts w:ascii="Calibri" w:hAnsi="Calibri" w:cs="Calibri"/>
+        </w:rPr>
+        <w:t>six sampl</w:t>
+      </w:r>
+      <w:r>
+        <w:rPr>
+          <w:rFonts w:ascii="Calibri" w:hAnsi="Calibri" w:cs="Calibri"/>
+        </w:rPr>
+        <w:t xml:space="preserve">es each). </w:t>
+      </w:r>
+    </w:p>
+    <w:p>
+      <w:pPr>
+        <w:pStyle w:val="Heading4"/>
+      </w:pPr>
+      <w:r>
+        <w:t>Simulations</w:t>
+      </w:r>
+    </w:p>
+    <w:p>
+      <w:r>
+        <w:t xml:space="preserve">Simulations with demographic vital dynamics are run for a total of 30 years with constant, relatively low case management rates. The first 27 years are used as a </w:t>
+      </w:r>
+      <w:proofErr w:type="spellStart"/>
+      <w:r>
+        <w:t>burnin</w:t>
+      </w:r>
+      <w:proofErr w:type="spellEnd"/>
+      <w:r>
+        <w:t xml:space="preserve"> (to allow for acquisition of immunity), and simulation output from the final three years are saved and </w:t>
+      </w:r>
+      <w:r>
+        <w:t>compared against</w:t>
+      </w:r>
+      <w:r>
+        <w:t xml:space="preserve"> reference datasets. </w:t>
+      </w:r>
+    </w:p>
+    <w:p/>
+    <w:p>
+      <w:pPr>
+        <w:pStyle w:val="Heading2"/>
+      </w:pPr>
+      <w:r>
+        <w:t>Ouedraogo’s 2007 Burkina Faso sites</w:t>
+      </w:r>
+    </w:p>
+    <w:p>
+      <w:r>
+        <w:t xml:space="preserve">Papers: </w:t>
+      </w:r>
+      <w:hyperlink r:id="rId52" w:history="1">
+        <w:r>
+          <w:rPr>
+            <w:rStyle w:val="Hyperlink"/>
+          </w:rPr>
+          <w:t>Ouedraogo et al. 2016</w:t>
+        </w:r>
+      </w:hyperlink>
+      <w:r>
         <w:t xml:space="preserve">, </w:t>
       </w:r>
-      <w:hyperlink r:id="rId45" w:history="1">
-        <w:proofErr w:type="spellStart"/>
-        <w:r>
-          <w:rPr>
-            <w:rStyle w:val="Hyperlink"/>
-            <w:rFonts w:ascii="Calibri" w:hAnsi="Calibri" w:cs="Calibri"/>
-          </w:rPr>
-          <w:t>Bretscher</w:t>
-        </w:r>
-        <w:proofErr w:type="spellEnd"/>
-        <w:r>
-          <w:rPr>
-            <w:rStyle w:val="Hyperlink"/>
-            <w:rFonts w:ascii="Calibri" w:hAnsi="Calibri" w:cs="Calibri"/>
-          </w:rPr>
-          <w:t xml:space="preserve"> et al. 2015</w:t>
-        </w:r>
-      </w:hyperlink>
-      <w:r>
-        <w:rPr>
-          <w:rFonts w:ascii="Calibri" w:hAnsi="Calibri" w:cs="Calibri"/>
-        </w:rPr>
-        <w:t xml:space="preserve">, </w:t>
-      </w:r>
-      <w:hyperlink r:id="rId46" w:history="1">
-        <w:proofErr w:type="spellStart"/>
-        <w:r>
-          <w:rPr>
-            <w:rStyle w:val="Hyperlink"/>
-            <w:rFonts w:ascii="Calibri" w:hAnsi="Calibri" w:cs="Calibri"/>
-          </w:rPr>
-          <w:t>Felger</w:t>
-        </w:r>
-        <w:proofErr w:type="spellEnd"/>
-        <w:r>
-          <w:rPr>
-            <w:rStyle w:val="Hyperlink"/>
-            <w:rFonts w:ascii="Calibri" w:hAnsi="Calibri" w:cs="Calibri"/>
-          </w:rPr>
-          <w:t xml:space="preserve"> et al. 2012</w:t>
-        </w:r>
-      </w:hyperlink>
-      <w:r>
-        <w:rPr>
-          <w:rFonts w:ascii="Calibri" w:hAnsi="Calibri" w:cs="Calibri"/>
-        </w:rPr>
-        <w:t xml:space="preserve">, </w:t>
-      </w:r>
-      <w:hyperlink r:id="rId47" w:history="1">
-        <w:r>
-          <w:rPr>
-            <w:rStyle w:val="Hyperlink"/>
-            <w:rFonts w:ascii="Calibri" w:hAnsi="Calibri" w:cs="Calibri"/>
-          </w:rPr>
-          <w:t>Owusu-</w:t>
-        </w:r>
-        <w:proofErr w:type="spellStart"/>
-        <w:r>
-          <w:rPr>
-            <w:rStyle w:val="Hyperlink"/>
-            <w:rFonts w:ascii="Calibri" w:hAnsi="Calibri" w:cs="Calibri"/>
-          </w:rPr>
-          <w:t>Aguei</w:t>
-        </w:r>
-        <w:proofErr w:type="spellEnd"/>
-        <w:r>
-          <w:rPr>
-            <w:rStyle w:val="Hyperlink"/>
-            <w:rFonts w:ascii="Calibri" w:hAnsi="Calibri" w:cs="Calibri"/>
-          </w:rPr>
-          <w:t xml:space="preserve"> et al. 2002</w:t>
-        </w:r>
-      </w:hyperlink>
-    </w:p>
-    <w:p>
-      <w:pPr>
-        <w:rPr>
-          <w:rFonts w:ascii="Calibri" w:hAnsi="Calibri" w:cs="Calibri"/>
-        </w:rPr>
-      </w:pPr>
-      <w:hyperlink r:id="rId48" w:history="1">
-        <w:r>
-          <w:rPr>
-            <w:rStyle w:val="Hyperlink"/>
-            <w:rFonts w:ascii="Calibri" w:hAnsi="Calibri" w:cs="Calibri"/>
-          </w:rPr>
-          <w:t>Data on Malaria Team Dropbox</w:t>
-        </w:r>
-      </w:hyperlink>
-    </w:p>
-    <w:p>
-      <w:pPr>
-        <w:pStyle w:val="Heading4"/>
-      </w:pPr>
-      <w:r>
-        <w:t>Case management</w:t>
-      </w:r>
-    </w:p>
-    <w:p>
-      <w:r>
-        <w:t>Treatment was not administered as part of the study, though individuals who were sick at a survey date “were referred to routine health services” (</w:t>
-      </w:r>
-      <w:proofErr w:type="spellStart"/>
-      <w:r>
-        <w:rPr>
-          <w:rFonts w:ascii="Calibri" w:hAnsi="Calibri" w:cs="Calibri"/>
-        </w:rPr>
-        <w:fldChar w:fldCharType="begin"/>
-      </w:r>
-      <w:r>
-        <w:rPr>
-          <w:rFonts w:ascii="Calibri" w:hAnsi="Calibri" w:cs="Calibri"/>
-        </w:rPr>
-        <w:instrText xml:space="preserve"> HYPERLINK "https://journals.plos.org/plosone/article?id=10.1371/journal.pone.0045542" </w:instrText>
-      </w:r>
-      <w:r>
-        <w:rPr>
-          <w:rFonts w:ascii="Calibri" w:hAnsi="Calibri" w:cs="Calibri"/>
-        </w:rPr>
-        <w:fldChar w:fldCharType="separate"/>
-      </w:r>
-      <w:r>
-        <w:rPr>
-          <w:rStyle w:val="Hyperlink"/>
-          <w:rFonts w:ascii="Calibri" w:hAnsi="Calibri" w:cs="Calibri"/>
-        </w:rPr>
-        <w:t>Felger</w:t>
-      </w:r>
-      <w:proofErr w:type="spellEnd"/>
-      <w:r>
-        <w:rPr>
-          <w:rStyle w:val="Hyperlink"/>
-          <w:rFonts w:ascii="Calibri" w:hAnsi="Calibri" w:cs="Calibri"/>
-        </w:rPr>
-        <w:t xml:space="preserve"> et al. 2012</w:t>
-      </w:r>
-      <w:r>
-        <w:rPr>
-          <w:rFonts w:ascii="Calibri" w:hAnsi="Calibri" w:cs="Calibri"/>
-        </w:rPr>
-        <w:fldChar w:fldCharType="end"/>
-      </w:r>
-      <w:r>
-        <w:t>). It does not sound like antimalarial treatments were common,</w:t>
-      </w:r>
-      <w:r>
-        <w:t xml:space="preserve"> and most were likely given to younger children: “</w:t>
-      </w:r>
-      <w:r>
-        <w:t>For the youngest age groups, short durations may partly reflect effects of antimalaria treatment, mainly affecting &lt;2 years old children. Treatment was infrequent but could not be formally incorporated into the models because of absence of comprehensive individual-level data</w:t>
-      </w:r>
-      <w:r>
-        <w:t>”</w:t>
-      </w:r>
-      <w:r>
-        <w:t xml:space="preserve"> </w:t>
-      </w:r>
-      <w:r>
-        <w:t>(</w:t>
-      </w:r>
-      <w:proofErr w:type="spellStart"/>
-      <w:r>
-        <w:rPr>
-          <w:rFonts w:ascii="Calibri" w:hAnsi="Calibri" w:cs="Calibri"/>
-        </w:rPr>
-        <w:fldChar w:fldCharType="begin"/>
-      </w:r>
-      <w:r>
-        <w:rPr>
-          <w:rFonts w:ascii="Calibri" w:hAnsi="Calibri" w:cs="Calibri"/>
-        </w:rPr>
-        <w:instrText xml:space="preserve"> HYPERLINK "https://journals.plos.org/plosone/article?id=10.1371/journal.pone.0045542" </w:instrText>
-      </w:r>
-      <w:r>
-        <w:rPr>
-          <w:rFonts w:ascii="Calibri" w:hAnsi="Calibri" w:cs="Calibri"/>
-        </w:rPr>
-        <w:fldChar w:fldCharType="separate"/>
-      </w:r>
-      <w:r>
-        <w:rPr>
-          <w:rStyle w:val="Hyperlink"/>
-          <w:rFonts w:ascii="Calibri" w:hAnsi="Calibri" w:cs="Calibri"/>
-        </w:rPr>
-        <w:t>Felger</w:t>
-      </w:r>
-      <w:proofErr w:type="spellEnd"/>
-      <w:r>
-        <w:rPr>
-          <w:rStyle w:val="Hyperlink"/>
-          <w:rFonts w:ascii="Calibri" w:hAnsi="Calibri" w:cs="Calibri"/>
-        </w:rPr>
-        <w:t xml:space="preserve"> et al. 2012</w:t>
-      </w:r>
-      <w:r>
-        <w:rPr>
-          <w:rFonts w:ascii="Calibri" w:hAnsi="Calibri" w:cs="Calibri"/>
-        </w:rPr>
-        <w:fldChar w:fldCharType="end"/>
-      </w:r>
-      <w:r>
-        <w:t>).</w:t>
-      </w:r>
-    </w:p>
-    <w:p>
-      <w:r>
-        <w:t xml:space="preserve">Lacking other information, we assume a treatment rate </w:t>
-      </w:r>
-      <w:r>
-        <w:t xml:space="preserve">for clinical malaria </w:t>
-      </w:r>
-      <w:r>
-        <w:t>of 20% in children U5, 10% in adults, and 50% in severe cases</w:t>
-      </w:r>
-      <w:r>
-        <w:t>, both before and during the study</w:t>
-      </w:r>
-      <w:r>
-        <w:t xml:space="preserve"> period</w:t>
-      </w:r>
-      <w:r>
-        <w:t>.</w:t>
-      </w:r>
-      <w:r>
-        <w:t xml:space="preserve"> </w:t>
-      </w:r>
-    </w:p>
-    <w:p>
-      <w:pPr>
-        <w:pStyle w:val="Heading4"/>
-      </w:pPr>
-      <w:r>
-        <w:t>EIR</w:t>
-      </w:r>
-    </w:p>
-    <w:p>
-      <w:pPr>
-        <w:rPr>
-          <w:rFonts w:ascii="Calibri" w:hAnsi="Calibri" w:cs="Calibri"/>
-        </w:rPr>
-      </w:pPr>
-      <w:r>
-        <w:rPr>
-          <w:rFonts w:ascii="Calibri" w:hAnsi="Calibri" w:cs="Calibri"/>
-        </w:rPr>
-        <w:t xml:space="preserve">The </w:t>
-      </w:r>
-      <w:r>
-        <w:rPr>
-          <w:rFonts w:ascii="Calibri" w:hAnsi="Calibri" w:cs="Calibri"/>
-        </w:rPr>
-        <w:t>average of three years (2001-2003) of monthly EIRs reported in Kasasa et al. 2013</w:t>
-      </w:r>
-      <w:r>
-        <w:rPr>
-          <w:rFonts w:ascii="Calibri" w:hAnsi="Calibri" w:cs="Calibri"/>
-        </w:rPr>
-        <w:t xml:space="preserve"> were used</w:t>
-      </w:r>
-      <w:r>
-        <w:rPr>
-          <w:rFonts w:ascii="Calibri" w:hAnsi="Calibri" w:cs="Calibri"/>
-        </w:rPr>
-        <w:t xml:space="preserve">. </w:t>
-      </w:r>
-      <w:r>
-        <w:rPr>
-          <w:rFonts w:ascii="Calibri" w:hAnsi="Calibri" w:cs="Calibri"/>
-        </w:rPr>
-        <w:t>The resulting seasonality and magnitude of EIRs are</w:t>
-      </w:r>
-      <w:r>
-        <w:rPr>
-          <w:rFonts w:ascii="Calibri" w:hAnsi="Calibri" w:cs="Calibri"/>
-        </w:rPr>
-        <w:t xml:space="preserve"> fairly </w:t>
-      </w:r>
-      <w:proofErr w:type="gramStart"/>
-      <w:r>
-        <w:rPr>
-          <w:rFonts w:ascii="Calibri" w:hAnsi="Calibri" w:cs="Calibri"/>
-        </w:rPr>
-        <w:t>similar to</w:t>
-      </w:r>
-      <w:proofErr w:type="gramEnd"/>
-      <w:r>
-        <w:rPr>
-          <w:rFonts w:ascii="Calibri" w:hAnsi="Calibri" w:cs="Calibri"/>
-        </w:rPr>
-        <w:t xml:space="preserve"> </w:t>
-      </w:r>
-      <w:r>
-        <w:rPr>
-          <w:rFonts w:ascii="Calibri" w:hAnsi="Calibri" w:cs="Calibri"/>
-        </w:rPr>
-        <w:t xml:space="preserve">the EIRs used for </w:t>
-      </w:r>
-      <w:proofErr w:type="spellStart"/>
-      <w:r>
-        <w:rPr>
-          <w:rFonts w:ascii="Calibri" w:hAnsi="Calibri" w:cs="Calibri"/>
-        </w:rPr>
-        <w:t>Dapelogo</w:t>
-      </w:r>
-      <w:proofErr w:type="spellEnd"/>
-      <w:r>
-        <w:rPr>
-          <w:rFonts w:ascii="Calibri" w:hAnsi="Calibri" w:cs="Calibri"/>
-        </w:rPr>
-        <w:t xml:space="preserve">, which is somewhat nearby. </w:t>
-      </w:r>
-      <w:r>
-        <w:rPr>
-          <w:rFonts w:ascii="Calibri" w:hAnsi="Calibri" w:cs="Calibri"/>
-        </w:rPr>
-        <w:t>However, there was a substantial amount of variation between the years in Kasasa et al, so adjustments to the magnitude of EIR may be warranted.</w:t>
-      </w:r>
-    </w:p>
-    <w:p>
-      <w:pPr>
-        <w:pStyle w:val="Heading4"/>
-      </w:pPr>
-      <w:r>
-        <w:t>Reference dataset</w:t>
-      </w:r>
-      <w:r>
-        <w:t>s</w:t>
-      </w:r>
-    </w:p>
-    <w:p>
-      <w:pPr>
-        <w:rPr>
-          <w:rFonts w:ascii="Calibri" w:hAnsi="Calibri" w:cs="Calibri"/>
-        </w:rPr>
-      </w:pPr>
-      <w:r>
-        <w:rPr>
-          <w:rFonts w:ascii="Calibri" w:hAnsi="Calibri" w:cs="Calibri"/>
-        </w:rPr>
-        <w:t>The</w:t>
-      </w:r>
-      <w:r>
-        <w:rPr>
-          <w:rFonts w:ascii="Calibri" w:hAnsi="Calibri" w:cs="Calibri"/>
-        </w:rPr>
-        <w:t xml:space="preserve"> </w:t>
-      </w:r>
-      <w:r>
-        <w:rPr>
-          <w:rFonts w:ascii="Calibri" w:hAnsi="Calibri" w:cs="Calibri"/>
-        </w:rPr>
-        <w:t xml:space="preserve">parasite density and duration-of-infection datasets come from </w:t>
-      </w:r>
-      <w:r>
-        <w:rPr>
-          <w:rFonts w:ascii="Calibri" w:hAnsi="Calibri" w:cs="Calibri"/>
-        </w:rPr>
-        <w:t>an age-stratified cohort of 347 individuals who were sampled every two months for a year (</w:t>
-      </w:r>
-      <w:r>
-        <w:rPr>
-          <w:rFonts w:ascii="Calibri" w:hAnsi="Calibri" w:cs="Calibri"/>
-        </w:rPr>
-        <w:t xml:space="preserve">for a total of </w:t>
-      </w:r>
-      <w:r>
-        <w:rPr>
-          <w:rFonts w:ascii="Calibri" w:hAnsi="Calibri" w:cs="Calibri"/>
-        </w:rPr>
-        <w:t>six sampl</w:t>
-      </w:r>
-      <w:r>
-        <w:rPr>
-          <w:rFonts w:ascii="Calibri" w:hAnsi="Calibri" w:cs="Calibri"/>
-        </w:rPr>
-        <w:t xml:space="preserve">es each). </w:t>
-      </w:r>
-    </w:p>
-    <w:p>
-      <w:pPr>
-        <w:pStyle w:val="Heading4"/>
-      </w:pPr>
-      <w:r>
-        <w:t>Simulations</w:t>
-      </w:r>
-    </w:p>
-    <w:p>
-      <w:r>
-        <w:t xml:space="preserve">Simulations with demographic vital dynamics are run for a total of 30 years with constant, relatively low case management rates. The first 27 years are used as a </w:t>
-      </w:r>
-      <w:proofErr w:type="spellStart"/>
-      <w:r>
-        <w:t>burnin</w:t>
-      </w:r>
-      <w:proofErr w:type="spellEnd"/>
-      <w:r>
-        <w:t xml:space="preserve"> (to allow for acquisition of immunity), and simulation output from the final three years are saved and </w:t>
-      </w:r>
-      <w:r>
-        <w:t>compared against</w:t>
-      </w:r>
-      <w:r>
-        <w:t xml:space="preserve"> reference datasets. </w:t>
-      </w:r>
-    </w:p>
-    <w:p/>
-    <w:p>
-      <w:pPr>
-        <w:pStyle w:val="Heading2"/>
-      </w:pPr>
-      <w:proofErr w:type="spellStart"/>
-      <w:r>
-        <w:t>Ouedraogo’s</w:t>
-      </w:r>
-      <w:proofErr w:type="spellEnd"/>
-      <w:r>
-        <w:t xml:space="preserve"> 2007 Burkina Faso sites</w:t>
-      </w:r>
-    </w:p>
-    <w:p>
-      <w:r>
-        <w:t xml:space="preserve">Papers: </w:t>
-      </w:r>
-      <w:hyperlink r:id="rId49" w:history="1">
-        <w:proofErr w:type="spellStart"/>
-        <w:r>
-          <w:rPr>
-            <w:rStyle w:val="Hyperlink"/>
-          </w:rPr>
-          <w:t>Ouedraogo</w:t>
-        </w:r>
-        <w:proofErr w:type="spellEnd"/>
-        <w:r>
-          <w:rPr>
-            <w:rStyle w:val="Hyperlink"/>
-          </w:rPr>
-          <w:t xml:space="preserve"> et al. 2016</w:t>
-        </w:r>
-      </w:hyperlink>
-      <w:r>
-        <w:t xml:space="preserve">, </w:t>
-      </w:r>
       <w:r>
         <w:t xml:space="preserve">also information in EMOD calibration paper </w:t>
       </w:r>
-      <w:hyperlink r:id="rId50" w:history="1">
+      <w:hyperlink r:id="rId53" w:history="1">
         <w:r>
           <w:rPr>
             <w:rStyle w:val="Hyperlink"/>
@@ -3630,13 +3344,8 @@
       <w:pPr>
         <w:pStyle w:val="Heading3"/>
       </w:pPr>
-      <w:proofErr w:type="spellStart"/>
-      <w:r>
-        <w:t>Laye</w:t>
-      </w:r>
-      <w:proofErr w:type="spellEnd"/>
-      <w:r>
-        <w:t>, Burkina Faso, 2007-2008</w:t>
+      <w:r>
+        <w:t>Laye, Burkina Faso, 2007-2008</w:t>
       </w:r>
     </w:p>
     <w:p>
@@ -3691,7 +3400,7 @@
       <w:r>
         <w:t xml:space="preserve">Taken from prior recalibration setup (I assume – values were in </w:t>
       </w:r>
-      <w:hyperlink r:id="rId51" w:anchor="L37" w:history="1">
+      <w:hyperlink r:id="rId54" w:anchor="L37" w:history="1">
         <w:r>
           <w:rPr>
             <w:rStyle w:val="Hyperlink"/>
@@ -3702,7 +3411,7 @@
       <w:r>
         <w:t xml:space="preserve">). As reported in </w:t>
       </w:r>
-      <w:hyperlink r:id="rId52" w:history="1">
+      <w:hyperlink r:id="rId55" w:history="1">
         <w:r>
           <w:rPr>
             <w:rStyle w:val="Hyperlink"/>
@@ -3722,17 +3431,9 @@
       </w:r>
       <w:proofErr w:type="spellEnd"/>
       <w:r>
-        <w:t xml:space="preserve"> and 30 in </w:t>
-      </w:r>
-      <w:proofErr w:type="spellStart"/>
-      <w:r>
-        <w:t>Laye</w:t>
-      </w:r>
-      <w:proofErr w:type="spellEnd"/>
-      <w:r>
-        <w:t xml:space="preserve"> [</w:t>
-      </w:r>
-      <w:hyperlink r:id="rId53" w:anchor="ref-CR33" w:tooltip="Ouedraogo AL, Roeffen W, Luty AJF, de Vlas SJ, Nebie I, Ilboudo-Saogo E, et al.Naturally acquired immune responses to Plasmodium falciparum sexual stage antigens Pfs48/45 and Pfs230 in an area of seasonal transmission. Infect Immun. 2011; 79(1):4957–64." w:history="1">
+        <w:t xml:space="preserve"> and 30 in Laye [</w:t>
+      </w:r>
+      <w:hyperlink r:id="rId56" w:anchor="ref-CR33" w:tooltip="Ouedraogo AL, Roeffen W, Luty AJF, de Vlas SJ, Nebie I, Ilboudo-Saogo E, et al.Naturally acquired immune responses to Plasmodium falciparum sexual stage antigens Pfs48/45 and Pfs230 in an area of seasonal transmission. Infect Immun. 2011; 79(1):4957–64." w:history="1">
         <w:r>
           <w:rPr>
             <w:rStyle w:val="Hyperlink"/>
@@ -3759,20 +3460,12 @@
       <w:r>
         <w:t xml:space="preserve">The longitudinal study </w:t>
       </w:r>
-      <w:hyperlink r:id="rId54" w:history="1">
-        <w:proofErr w:type="spellStart"/>
-        <w:r>
-          <w:rPr>
-            <w:rStyle w:val="Hyperlink"/>
-          </w:rPr>
-          <w:t>Ouedraogo</w:t>
-        </w:r>
-        <w:proofErr w:type="spellEnd"/>
-        <w:r>
-          <w:rPr>
-            <w:rStyle w:val="Hyperlink"/>
-          </w:rPr>
-          <w:t xml:space="preserve"> et al. 2016</w:t>
+      <w:hyperlink r:id="rId57" w:history="1">
+        <w:r>
+          <w:rPr>
+            <w:rStyle w:val="Hyperlink"/>
+          </w:rPr>
+          <w:t>Ouedraogo et al. 2016</w:t>
         </w:r>
       </w:hyperlink>
       <w:r>
@@ -3787,7 +3480,7 @@
       <w:r>
         <w:t xml:space="preserve">The data values were taken from the hardcoded values in </w:t>
       </w:r>
-      <w:hyperlink r:id="rId55" w:history="1">
+      <w:hyperlink r:id="rId58" w:history="1">
         <w:r>
           <w:rPr>
             <w:rStyle w:val="Hyperlink"/>
@@ -3823,15 +3516,7 @@
     </w:p>
     <w:p>
       <w:r>
-        <w:t xml:space="preserve">Paper: </w:t>
-      </w:r>
-      <w:proofErr w:type="spellStart"/>
-      <w:r>
-        <w:t>Molineaux</w:t>
-      </w:r>
-      <w:proofErr w:type="spellEnd"/>
-      <w:r>
-        <w:t xml:space="preserve"> et al. 1980</w:t>
+        <w:t>Paper: Molineaux et al. 1980</w:t>
       </w:r>
       <w:r>
         <w:t xml:space="preserve">. The Garki project. </w:t>
@@ -3860,30 +3545,22 @@
       </w:r>
       <w:proofErr w:type="spellEnd"/>
       <w:r>
-        <w:t xml:space="preserve"> </w:t>
-      </w:r>
-      <w:proofErr w:type="spellStart"/>
-      <w:r>
-        <w:t>Marke</w:t>
+        <w:t xml:space="preserve"> Marke, Nigeria, 1970-1972</w:t>
+      </w:r>
+    </w:p>
+    <w:p>
+      <w:pPr>
+        <w:pStyle w:val="Heading3"/>
+      </w:pPr>
+      <w:proofErr w:type="spellStart"/>
+      <w:r>
+        <w:t>Sugungum</w:t>
       </w:r>
       <w:proofErr w:type="spellEnd"/>
       <w:r>
         <w:t>, Nigeria, 1970-1972</w:t>
       </w:r>
     </w:p>
-    <w:p>
-      <w:pPr>
-        <w:pStyle w:val="Heading3"/>
-      </w:pPr>
-      <w:proofErr w:type="spellStart"/>
-      <w:r>
-        <w:t>Sugungum</w:t>
-      </w:r>
-      <w:proofErr w:type="spellEnd"/>
-      <w:r>
-        <w:t>, Nigeria, 1970-1972</w:t>
-      </w:r>
-    </w:p>
     <w:p/>
     <w:p>
       <w:pPr>
@@ -3903,7 +3580,7 @@
       <w:r>
         <w:t xml:space="preserve">I assume – values were in </w:t>
       </w:r>
-      <w:hyperlink r:id="rId56" w:anchor="L37" w:history="1">
+      <w:hyperlink r:id="rId59" w:anchor="L37" w:history="1">
         <w:r>
           <w:rPr>
             <w:rStyle w:val="Hyperlink"/>
@@ -3917,7 +3594,7 @@
       <w:r>
         <w:t xml:space="preserve">. As reported in </w:t>
       </w:r>
-      <w:hyperlink r:id="rId57" w:history="1">
+      <w:hyperlink r:id="rId60" w:history="1">
         <w:r>
           <w:rPr>
             <w:rStyle w:val="Hyperlink"/>
@@ -3931,7 +3608,7 @@
       <w:r>
         <w:t>In the Garki sites, monthly EIR was calculated by averaging the product of human biting rate and sporozoite rate over the days of the month when data was collected [</w:t>
       </w:r>
-      <w:hyperlink r:id="rId58" w:anchor="ref-CR2" w:tooltip="Molineaux L, Gramiccia G, World Health Organization. The Garki project: research on the epidemiology and control of malaria in the Sudan savanna of West Africa.1980." w:history="1">
+      <w:hyperlink r:id="rId61" w:anchor="ref-CR2" w:tooltip="Molineaux L, Gramiccia G, World Health Organization. The Garki project: research on the epidemiology and control of malaria in the Sudan savanna of West Africa.1980." w:history="1">
         <w:r>
           <w:rPr>
             <w:rStyle w:val="Hyperlink"/>
@@ -3942,7 +3619,7 @@
       <w:r>
         <w:t>], then multiplying this value by the number of days in the month. Parasite prevalence data from infants, stratified by density and month of observation, were used to infer monthly EIR when entomological data was not available. Monthly EIR values were adaptively tuned for a given parameter set until there was a good fit of simulation data to the reference dataset (Fig. </w:t>
       </w:r>
-      <w:hyperlink r:id="rId59" w:anchor="Fig1" w:history="1">
+      <w:hyperlink r:id="rId62" w:anchor="Fig1" w:history="1">
         <w:r>
           <w:rPr>
             <w:rStyle w:val="Hyperlink"/>
@@ -4012,15 +3689,7 @@
         <w:t xml:space="preserve"> (</w:t>
       </w:r>
       <w:r>
-        <w:t xml:space="preserve">page 50 of </w:t>
-      </w:r>
-      <w:proofErr w:type="spellStart"/>
-      <w:r>
-        <w:t>Molineaux</w:t>
-      </w:r>
-      <w:proofErr w:type="spellEnd"/>
-      <w:r>
-        <w:t xml:space="preserve"> et al. 1980</w:t>
+        <w:t>page 50 of Molineaux et al. 1980</w:t>
       </w:r>
       <w:r>
         <w:t>)</w:t>
@@ -4062,7 +3731,7 @@
       <w:r>
         <w:t xml:space="preserve">Comes from </w:t>
       </w:r>
-      <w:hyperlink r:id="rId60" w:history="1">
+      <w:hyperlink r:id="rId63" w:history="1">
         <w:r>
           <w:rPr>
             <w:rStyle w:val="Hyperlink"/>
@@ -4085,7 +3754,7 @@
       <w:r>
         <w:t xml:space="preserve"> in the </w:t>
       </w:r>
-      <w:hyperlink r:id="rId61" w:history="1">
+      <w:hyperlink r:id="rId64" w:history="1">
         <w:r>
           <w:rPr>
             <w:rStyle w:val="Hyperlink"/>
@@ -4140,7 +3809,7 @@
       <w:r>
         <w:t xml:space="preserve">comment in </w:t>
       </w:r>
-      <w:hyperlink r:id="rId62" w:anchor="L371" w:history="1">
+      <w:hyperlink r:id="rId65" w:anchor="L371" w:history="1">
         <w:r>
           <w:rPr>
             <w:rStyle w:val="Hyperlink"/>
@@ -4300,13 +3969,21 @@
       </w:r>
       <w:proofErr w:type="gramEnd"/>
       <w:r>
-        <w:t>(N) * (exp(-S*X)</w:t>
-      </w:r>
+        <w:t>(N) * (exp(-S*X</w:t>
+      </w:r>
+      <w:proofErr w:type="gramStart"/>
       <w:r>
         <w:t>)</w:t>
       </w:r>
       <w:r>
-        <w:t>^(</w:t>
+        <w:t>)</w:t>
+      </w:r>
+      <w:r>
+        <w:t>^</w:t>
+      </w:r>
+      <w:proofErr w:type="gramEnd"/>
+      <w:r>
+        <w:t>(</w:t>
       </w:r>
       <w:r>
         <w:t>200-N).</w:t>
@@ -4667,7 +4344,7 @@
       <w:r>
         <w:t xml:space="preserve">Paper: </w:t>
       </w:r>
-      <w:hyperlink r:id="rId63" w:history="1">
+      <w:hyperlink r:id="rId66" w:history="1">
         <w:proofErr w:type="spellStart"/>
         <w:r>
           <w:rPr>
@@ -4695,13 +4372,8 @@
           <w:numId w:val="2"/>
         </w:numPr>
       </w:pPr>
-      <w:proofErr w:type="spellStart"/>
-      <w:r>
-        <w:t>Matola</w:t>
-      </w:r>
-      <w:proofErr w:type="spellEnd"/>
-      <w:r>
-        <w:t>, Mozambique, 1994-1995 – incidence/age, prevalence/age</w:t>
+      <w:r>
+        <w:t>Matola, Mozambique, 1994-1995 – incidence/age, prevalence/age</w:t>
       </w:r>
     </w:p>
     <w:p>
@@ -4715,7 +4387,7 @@
       <w:r>
         <w:t xml:space="preserve">Paper: </w:t>
       </w:r>
-      <w:hyperlink r:id="rId64" w:history="1">
+      <w:hyperlink r:id="rId67" w:history="1">
         <w:r>
           <w:rPr>
             <w:rStyle w:val="Hyperlink"/>
@@ -4755,7 +4427,7 @@
       <w:r>
         <w:t xml:space="preserve">Paper: </w:t>
       </w:r>
-      <w:hyperlink r:id="rId65" w:history="1">
+      <w:hyperlink r:id="rId68" w:history="1">
         <w:proofErr w:type="spellStart"/>
         <w:r>
           <w:rPr>
@@ -4798,26 +4470,12 @@
       <w:r>
         <w:t xml:space="preserve">Paper: </w:t>
       </w:r>
-      <w:hyperlink r:id="rId66" w:history="1">
-        <w:r>
-          <w:rPr>
-            <w:rStyle w:val="Hyperlink"/>
-          </w:rPr>
-          <w:t>Rodriguez-</w:t>
-        </w:r>
-        <w:proofErr w:type="spellStart"/>
-        <w:r>
-          <w:rPr>
-            <w:rStyle w:val="Hyperlink"/>
-          </w:rPr>
-          <w:t>Barraquer</w:t>
-        </w:r>
-        <w:proofErr w:type="spellEnd"/>
-        <w:r>
-          <w:rPr>
-            <w:rStyle w:val="Hyperlink"/>
-          </w:rPr>
-          <w:t xml:space="preserve"> et al. 2018</w:t>
+      <w:hyperlink r:id="rId69" w:history="1">
+        <w:r>
+          <w:rPr>
+            <w:rStyle w:val="Hyperlink"/>
+          </w:rPr>
+          <w:t>Rodriguez-Barraquer et al. 2018</w:t>
         </w:r>
       </w:hyperlink>
     </w:p>
@@ -4844,7 +4502,7 @@
       <w:r>
         <w:t xml:space="preserve">Paper: </w:t>
       </w:r>
-      <w:hyperlink r:id="rId67" w:history="1">
+      <w:hyperlink r:id="rId70" w:history="1">
         <w:r>
           <w:rPr>
             <w:rStyle w:val="Hyperlink"/>
@@ -4884,7 +4542,7 @@
       <w:r>
         <w:t xml:space="preserve">Paper: </w:t>
       </w:r>
-      <w:hyperlink r:id="rId68" w:anchor="sec006" w:history="1">
+      <w:hyperlink r:id="rId71" w:anchor="sec006" w:history="1">
         <w:proofErr w:type="spellStart"/>
         <w:r>
           <w:rPr>
@@ -4928,7 +4586,7 @@
 </file>
 
 <file path=word/numbering.xml><?xml version="1.0" encoding="utf-8"?>
-<w:numbering xmlns:wpc="http://schemas.microsoft.com/office/word/2010/wordprocessingCanvas" xmlns:cx="http://schemas.microsoft.com/office/drawing/2014/chartex" xmlns:cx1="http://schemas.microsoft.com/office/drawing/2015/9/8/chartex" xmlns:cx2="http://schemas.microsoft.com/office/drawing/2015/10/21/chartex" xmlns:cx3="http://schemas.microsoft.com/office/drawing/2016/5/9/chartex" xmlns:cx4="http://schemas.microsoft.com/office/drawing/2016/5/10/chartex" xmlns:cx5="http://schemas.microsoft.com/office/drawing/2016/5/11/chartex" xmlns:cx6="http://schemas.microsoft.com/office/drawing/2016/5/12/chartex" xmlns:cx7="http://schemas.microsoft.com/office/drawing/2016/5/13/chartex" xmlns:cx8="http://schemas.microsoft.com/office/drawing/2016/5/14/chartex" xmlns:mc="http://schemas.openxmlformats.org/markup-compatibility/2006" xmlns:aink="http://schemas.microsoft.com/office/drawing/2016/ink" xmlns:am3d="http://schemas.microsoft.com/office/drawing/2017/model3d" xmlns:o="urn:schemas-microsoft-com:office:office" xmlns:oel="http://schemas.microsoft.com/office/2019/extlst" xmlns:r="http://schemas.openxmlformats.org/officeDocument/2006/relationships" xmlns:m="http://schemas.openxmlformats.org/officeDocument/2006/math" xmlns:v="urn:schemas-microsoft-com:vml" xmlns:wp14="http://schemas.microsoft.com/office/word/2010/wordprocessingDrawing" xmlns:wp="http://schemas.openxmlformats.org/drawingml/2006/wordprocessingDrawing" xmlns:w10="urn:schemas-microsoft-com:office:word" xmlns:w="http://schemas.openxmlformats.org/wordprocessingml/2006/main" xmlns:w14="http://schemas.microsoft.com/office/word/2010/wordml" xmlns:w15="http://schemas.microsoft.com/office/word/2012/wordml" xmlns:w16cex="http://schemas.microsoft.com/office/word/2018/wordml/cex" xmlns:w16cid="http://schemas.microsoft.com/office/word/2016/wordml/cid" xmlns:w16="http://schemas.microsoft.com/office/word/2018/wordml" xmlns:w16sdtdh="http://schemas.microsoft.com/office/word/2020/wordml/sdtdatahash" xmlns:w16se="http://schemas.microsoft.com/office/word/2015/wordml/symex" xmlns:wpg="http://schemas.microsoft.com/office/word/2010/wordprocessingGroup" xmlns:wpi="http://schemas.microsoft.com/office/word/2010/wordprocessingInk" xmlns:wne="http://schemas.microsoft.com/office/word/2006/wordml" xmlns:wps="http://schemas.microsoft.com/office/word/2010/wordprocessingShape" mc:Ignorable="w14 w15 w16se w16cid w16 w16cex w16sdtdh wp14">
+<w:numbering xmlns:wpc="http://schemas.microsoft.com/office/word/2010/wordprocessingCanvas" xmlns:cx="http://schemas.microsoft.com/office/drawing/2014/chartex" xmlns:cx1="http://schemas.microsoft.com/office/drawing/2015/9/8/chartex" xmlns:cx2="http://schemas.microsoft.com/office/drawing/2015/10/21/chartex" xmlns:cx3="http://schemas.microsoft.com/office/drawing/2016/5/9/chartex" xmlns:cx4="http://schemas.microsoft.com/office/drawing/2016/5/10/chartex" xmlns:cx5="http://schemas.microsoft.com/office/drawing/2016/5/11/chartex" xmlns:cx6="http://schemas.microsoft.com/office/drawing/2016/5/12/chartex" xmlns:cx7="http://schemas.microsoft.com/office/drawing/2016/5/13/chartex" xmlns:cx8="http://schemas.microsoft.com/office/drawing/2016/5/14/chartex" xmlns:mc="http://schemas.openxmlformats.org/markup-compatibility/2006" xmlns:aink="http://schemas.microsoft.com/office/drawing/2016/ink" xmlns:am3d="http://schemas.microsoft.com/office/drawing/2017/model3d" xmlns:o="urn:schemas-microsoft-com:office:office" xmlns:oel="http://schemas.microsoft.com/office/2019/extlst" xmlns:r="http://schemas.openxmlformats.org/officeDocument/2006/relationships" xmlns:m="http://schemas.openxmlformats.org/officeDocument/2006/math" xmlns:v="urn:schemas-microsoft-com:vml" xmlns:wp14="http://schemas.microsoft.com/office/word/2010/wordprocessingDrawing" xmlns:wp="http://schemas.openxmlformats.org/drawingml/2006/wordprocessingDrawing" xmlns:w10="urn:schemas-microsoft-com:office:word" xmlns:w="http://schemas.openxmlformats.org/wordprocessingml/2006/main" xmlns:w14="http://schemas.microsoft.com/office/word/2010/wordml" xmlns:w15="http://schemas.microsoft.com/office/word/2012/wordml" xmlns:w16cex="http://schemas.microsoft.com/office/word/2018/wordml/cex" xmlns:w16cid="http://schemas.microsoft.com/office/word/2016/wordml/cid" xmlns:w16="http://schemas.microsoft.com/office/word/2018/wordml" xmlns:w16du="http://schemas.microsoft.com/office/word/2023/wordml/word16du" xmlns:w16sdtdh="http://schemas.microsoft.com/office/word/2020/wordml/sdtdatahash" xmlns:w16sdtfl="http://schemas.microsoft.com/office/word/2024/wordml/sdtformatlock" xmlns:w16se="http://schemas.microsoft.com/office/word/2015/wordml/symex" xmlns:wpg="http://schemas.microsoft.com/office/word/2010/wordprocessingGroup" xmlns:wpi="http://schemas.microsoft.com/office/word/2010/wordprocessingInk" xmlns:wne="http://schemas.microsoft.com/office/word/2006/wordml" xmlns:wps="http://schemas.microsoft.com/office/word/2010/wordprocessingShape" mc:Ignorable="w14 w15 w16se w16cid w16 w16cex w16sdtdh w16sdtfl w16du wp14">
   <w:abstractNum w:abstractNumId="0" w15:restartNumberingAfterBreak="0">
     <w:nsid w:val="3FF42D3E"/>
     <w:multiLevelType w:val="hybridMultilevel"/>
@@ -5165,7 +4823,7 @@
 </file>
 
 <file path=word/styles.xml><?xml version="1.0" encoding="utf-8"?>
-<w:styles xmlns:mc="http://schemas.openxmlformats.org/markup-compatibility/2006" xmlns:r="http://schemas.openxmlformats.org/officeDocument/2006/relationships" xmlns:w="http://schemas.openxmlformats.org/wordprocessingml/2006/main" xmlns:w14="http://schemas.microsoft.com/office/word/2010/wordml" xmlns:w15="http://schemas.microsoft.com/office/word/2012/wordml" xmlns:w16cex="http://schemas.microsoft.com/office/word/2018/wordml/cex" xmlns:w16cid="http://schemas.microsoft.com/office/word/2016/wordml/cid" xmlns:w16="http://schemas.microsoft.com/office/word/2018/wordml" xmlns:w16sdtdh="http://schemas.microsoft.com/office/word/2020/wordml/sdtdatahash" xmlns:w16se="http://schemas.microsoft.com/office/word/2015/wordml/symex" mc:Ignorable="w14 w15 w16se w16cid w16 w16cex w16sdtdh">
+<w:styles xmlns:mc="http://schemas.openxmlformats.org/markup-compatibility/2006" xmlns:r="http://schemas.openxmlformats.org/officeDocument/2006/relationships" xmlns:w="http://schemas.openxmlformats.org/wordprocessingml/2006/main" xmlns:w14="http://schemas.microsoft.com/office/word/2010/wordml" xmlns:w15="http://schemas.microsoft.com/office/word/2012/wordml" xmlns:w16cex="http://schemas.microsoft.com/office/word/2018/wordml/cex" xmlns:w16cid="http://schemas.microsoft.com/office/word/2016/wordml/cid" xmlns:w16="http://schemas.microsoft.com/office/word/2018/wordml" xmlns:w16du="http://schemas.microsoft.com/office/word/2023/wordml/word16du" xmlns:w16sdtdh="http://schemas.microsoft.com/office/word/2020/wordml/sdtdatahash" xmlns:w16sdtfl="http://schemas.microsoft.com/office/word/2024/wordml/sdtformatlock" xmlns:w16se="http://schemas.microsoft.com/office/word/2015/wordml/symex" mc:Ignorable="w14 w15 w16se w16cid w16 w16cex w16sdtdh w16sdtfl w16du">
   <w:docDefaults>
     <w:rPrDefault>
       <w:rPr>

</xml_diff>